<commit_message>
Full-floor reruns resolve all dagger rows; update ranges in paper and overview
Co-Authored-By: Claude Sonnet 5.5 <noreply@anthropic.com>
Claude-Session: https://claude.ai/code/session_01Tm2YrptvV5UNdA6T6XQsRW
</commit_message>
<xml_diff>
--- a/AARON/evaluation/PIPELINE_OVERVIEW.docx
+++ b/AARON/evaluation/PIPELINE_OVERVIEW.docx
@@ -549,7 +549,7 @@
         <w:t xml:space="preserve"> </w:t>
       </w:r>
       <w:r>
-        <w:t xml:space="preserve">an MPS-based circuit is still 5–74× cheaper than the filter, so</w:t>
+        <w:t xml:space="preserve">an MPS-based circuit is still 5–216× (median ≈22×) cheaper than the filter, so</w:t>
       </w:r>
       <w:r>
         <w:t xml:space="preserve"> </w:t>
@@ -2665,7 +2665,7 @@
               <w:jc w:val="left"/>
             </w:pPr>
             <w:r>
-              <w:t xml:space="preserve">number of pulses (4–11 in practice)</w:t>
+              <w:t xml:space="preserve">number of pulses (4–6 in the floor designs)</w:t>
             </w:r>
           </w:p>
         </w:tc>
@@ -9311,79 +9311,445 @@
               <w:jc w:val="left"/>
             </w:pPr>
             <w:r>
-              <w:t xml:space="preserve">– †</w:t>
-            </w:r>
-          </w:p>
-        </w:tc>
-        <w:tc>
-          <w:tcPr/>
-          <w:p>
-            <w:pPr>
-              <w:pStyle w:val="Compact"/>
-              <w:jc w:val="left"/>
-            </w:pPr>
-            <w:r>
-              <w:t xml:space="preserve">–</w:t>
-            </w:r>
-          </w:p>
-        </w:tc>
-        <w:tc>
-          <w:tcPr/>
-          <w:p>
-            <w:pPr>
-              <w:pStyle w:val="Compact"/>
-              <w:jc w:val="left"/>
-            </w:pPr>
-            <w:r>
-              <w:t xml:space="preserve">–</w:t>
-            </w:r>
-          </w:p>
-        </w:tc>
-        <w:tc>
-          <w:tcPr/>
-          <w:p>
-            <w:pPr>
-              <w:pStyle w:val="Compact"/>
-              <w:jc w:val="left"/>
-            </w:pPr>
-            <w:r>
-              <w:t xml:space="preserve">–</w:t>
-            </w:r>
-          </w:p>
-        </w:tc>
-        <w:tc>
-          <w:tcPr/>
-          <w:p>
-            <w:pPr>
-              <w:pStyle w:val="Compact"/>
-              <w:jc w:val="left"/>
-            </w:pPr>
-            <w:r>
-              <w:t xml:space="preserve">50 / 3,177</w:t>
-            </w:r>
-          </w:p>
-        </w:tc>
-        <w:tc>
-          <w:tcPr/>
-          <w:p>
-            <w:pPr>
-              <w:pStyle w:val="Compact"/>
-              <w:jc w:val="left"/>
-            </w:pPr>
-            <w:r>
-              <w:t xml:space="preserve">– / –</w:t>
-            </w:r>
-          </w:p>
-        </w:tc>
-        <w:tc>
-          <w:tcPr/>
-          <w:p>
-            <w:pPr>
-              <w:pStyle w:val="Compact"/>
-              <w:jc w:val="left"/>
-            </w:pPr>
-            <w:r>
-              <w:t xml:space="preserve">–</w:t>
+              <w:t xml:space="preserve">48</w:t>
+            </w:r>
+          </w:p>
+        </w:tc>
+        <w:tc>
+          <w:tcPr/>
+          <w:p>
+            <w:pPr>
+              <w:pStyle w:val="Compact"/>
+              <w:jc w:val="left"/>
+            </w:pPr>
+            <w:r>
+              <w:t xml:space="preserve">3,051</w:t>
+            </w:r>
+          </w:p>
+        </w:tc>
+        <w:tc>
+          <w:tcPr/>
+          <w:p>
+            <w:pPr>
+              <w:pStyle w:val="Compact"/>
+              <w:jc w:val="left"/>
+            </w:pPr>
+            <w:r>
+              <w:t xml:space="preserve">0.0004</w:t>
+            </w:r>
+          </w:p>
+        </w:tc>
+        <w:tc>
+          <w:tcPr/>
+          <w:p>
+            <w:pPr>
+              <w:pStyle w:val="Compact"/>
+              <w:jc w:val="left"/>
+            </w:pPr>
+            <w:r>
+              <w:t xml:space="preserve">0.45</w:t>
+            </w:r>
+          </w:p>
+        </w:tc>
+        <w:tc>
+          <w:tcPr/>
+          <w:p>
+            <w:pPr>
+              <w:pStyle w:val="Compact"/>
+              <w:jc w:val="left"/>
+            </w:pPr>
+            <w:r>
+              <w:t xml:space="preserve">36 / 2,295</w:t>
+            </w:r>
+          </w:p>
+        </w:tc>
+        <w:tc>
+          <w:tcPr/>
+          <w:p>
+            <w:pPr>
+              <w:pStyle w:val="Compact"/>
+              <w:jc w:val="left"/>
+            </w:pPr>
+            <w:r>
+              <w:t xml:space="preserve">61683 / 3,886,056</w:t>
+            </w:r>
+          </w:p>
+        </w:tc>
+        <w:tc>
+          <w:tcPr/>
+          <w:p>
+            <w:pPr>
+              <w:pStyle w:val="Compact"/>
+              <w:jc w:val="left"/>
+            </w:pPr>
+            <w:r>
+              <w:t xml:space="preserve">1274×</w:t>
+            </w:r>
+          </w:p>
+        </w:tc>
+      </w:tr>
+      <w:tr>
+        <w:tc>
+          <w:tcPr/>
+          <w:p>
+            <w:pPr>
+              <w:pStyle w:val="Compact"/>
+              <w:jc w:val="left"/>
+            </w:pPr>
+            <w:r>
+              <w:t xml:space="preserve">12</w:t>
+            </w:r>
+          </w:p>
+        </w:tc>
+        <w:tc>
+          <w:tcPr/>
+          <w:p>
+            <w:pPr>
+              <w:pStyle w:val="Compact"/>
+              <w:jc w:val="left"/>
+            </w:pPr>
+            <w:r>
+              <w:t xml:space="preserve">0</w:t>
+            </w:r>
+          </w:p>
+        </w:tc>
+        <w:tc>
+          <w:tcPr/>
+          <w:p>
+            <w:pPr>
+              <w:pStyle w:val="Compact"/>
+              <w:jc w:val="left"/>
+            </w:pPr>
+            <w:r>
+              <w:t xml:space="preserve">0.1</w:t>
+            </w:r>
+          </w:p>
+        </w:tc>
+        <w:tc>
+          <w:tcPr/>
+          <w:p>
+            <w:pPr>
+              <w:pStyle w:val="Compact"/>
+              <w:jc w:val="left"/>
+            </w:pPr>
+            <w:r>
+              <w:t xml:space="preserve">20</w:t>
+            </w:r>
+          </w:p>
+        </w:tc>
+        <w:tc>
+          <w:tcPr/>
+          <w:p>
+            <w:pPr>
+              <w:pStyle w:val="Compact"/>
+              <w:jc w:val="left"/>
+            </w:pPr>
+            <w:r>
+              <w:t xml:space="preserve">1,573</w:t>
+            </w:r>
+          </w:p>
+        </w:tc>
+        <w:tc>
+          <w:tcPr/>
+          <w:p>
+            <w:pPr>
+              <w:pStyle w:val="Compact"/>
+              <w:jc w:val="left"/>
+            </w:pPr>
+            <w:r>
+              <w:t xml:space="preserve">0.0071</w:t>
+            </w:r>
+          </w:p>
+        </w:tc>
+        <w:tc>
+          <w:tcPr/>
+          <w:p>
+            <w:pPr>
+              <w:pStyle w:val="Compact"/>
+              <w:jc w:val="left"/>
+            </w:pPr>
+            <w:r>
+              <w:t xml:space="preserve">0.55</w:t>
+            </w:r>
+          </w:p>
+        </w:tc>
+        <w:tc>
+          <w:tcPr/>
+          <w:p>
+            <w:pPr>
+              <w:pStyle w:val="Compact"/>
+              <w:jc w:val="left"/>
+            </w:pPr>
+            <w:r>
+              <w:t xml:space="preserve">7 / 572</w:t>
+            </w:r>
+          </w:p>
+        </w:tc>
+        <w:tc>
+          <w:tcPr/>
+          <w:p>
+            <w:pPr>
+              <w:pStyle w:val="Compact"/>
+              <w:jc w:val="left"/>
+            </w:pPr>
+            <w:r>
+              <w:t xml:space="preserve">2673 / 205,854</w:t>
+            </w:r>
+          </w:p>
+        </w:tc>
+        <w:tc>
+          <w:tcPr/>
+          <w:p>
+            <w:pPr>
+              <w:pStyle w:val="Compact"/>
+              <w:jc w:val="left"/>
+            </w:pPr>
+            <w:r>
+              <w:t xml:space="preserve">131×</w:t>
+            </w:r>
+          </w:p>
+        </w:tc>
+      </w:tr>
+      <w:tr>
+        <w:tc>
+          <w:tcPr/>
+          <w:p>
+            <w:pPr>
+              <w:pStyle w:val="Compact"/>
+              <w:jc w:val="left"/>
+            </w:pPr>
+            <w:r>
+              <w:t xml:space="preserve">12</w:t>
+            </w:r>
+          </w:p>
+        </w:tc>
+        <w:tc>
+          <w:tcPr/>
+          <w:p>
+            <w:pPr>
+              <w:pStyle w:val="Compact"/>
+              <w:jc w:val="left"/>
+            </w:pPr>
+            <w:r>
+              <w:t xml:space="preserve">0</w:t>
+            </w:r>
+          </w:p>
+        </w:tc>
+        <w:tc>
+          <w:tcPr/>
+          <w:p>
+            <w:pPr>
+              <w:pStyle w:val="Compact"/>
+              <w:jc w:val="left"/>
+            </w:pPr>
+            <w:r>
+              <w:t xml:space="preserve">0.01</w:t>
+            </w:r>
+          </w:p>
+        </w:tc>
+        <w:tc>
+          <w:tcPr/>
+          <w:p>
+            <w:pPr>
+              <w:pStyle w:val="Compact"/>
+              <w:jc w:val="left"/>
+            </w:pPr>
+            <w:r>
+              <w:t xml:space="preserve">32</w:t>
+            </w:r>
+          </w:p>
+        </w:tc>
+        <w:tc>
+          <w:tcPr/>
+          <w:p>
+            <w:pPr>
+              <w:pStyle w:val="Compact"/>
+              <w:jc w:val="left"/>
+            </w:pPr>
+            <w:r>
+              <w:t xml:space="preserve">2,497</w:t>
+            </w:r>
+          </w:p>
+        </w:tc>
+        <w:tc>
+          <w:tcPr/>
+          <w:p>
+            <w:pPr>
+              <w:pStyle w:val="Compact"/>
+              <w:jc w:val="left"/>
+            </w:pPr>
+            <w:r>
+              <w:t xml:space="preserve">0.0015</w:t>
+            </w:r>
+          </w:p>
+        </w:tc>
+        <w:tc>
+          <w:tcPr/>
+          <w:p>
+            <w:pPr>
+              <w:pStyle w:val="Compact"/>
+              <w:jc w:val="left"/>
+            </w:pPr>
+            <w:r>
+              <w:t xml:space="preserve">0.48</w:t>
+            </w:r>
+          </w:p>
+        </w:tc>
+        <w:tc>
+          <w:tcPr/>
+          <w:p>
+            <w:pPr>
+              <w:pStyle w:val="Compact"/>
+              <w:jc w:val="left"/>
+            </w:pPr>
+            <w:r>
+              <w:t xml:space="preserve">29 / 2,266</w:t>
+            </w:r>
+          </w:p>
+        </w:tc>
+        <w:tc>
+          <w:tcPr/>
+          <w:p>
+            <w:pPr>
+              <w:pStyle w:val="Compact"/>
+              <w:jc w:val="left"/>
+            </w:pPr>
+            <w:r>
+              <w:t xml:space="preserve">21651 / 1,667,160</w:t>
+            </w:r>
+          </w:p>
+        </w:tc>
+        <w:tc>
+          <w:tcPr/>
+          <w:p>
+            <w:pPr>
+              <w:pStyle w:val="Compact"/>
+              <w:jc w:val="left"/>
+            </w:pPr>
+            <w:r>
+              <w:t xml:space="preserve">668×</w:t>
+            </w:r>
+          </w:p>
+        </w:tc>
+      </w:tr>
+      <w:tr>
+        <w:tc>
+          <w:tcPr/>
+          <w:p>
+            <w:pPr>
+              <w:pStyle w:val="Compact"/>
+              <w:jc w:val="left"/>
+            </w:pPr>
+            <w:r>
+              <w:t xml:space="preserve">12</w:t>
+            </w:r>
+          </w:p>
+        </w:tc>
+        <w:tc>
+          <w:tcPr/>
+          <w:p>
+            <w:pPr>
+              <w:pStyle w:val="Compact"/>
+              <w:jc w:val="left"/>
+            </w:pPr>
+            <w:r>
+              <w:t xml:space="preserve">0</w:t>
+            </w:r>
+          </w:p>
+        </w:tc>
+        <w:tc>
+          <w:tcPr/>
+          <w:p>
+            <w:pPr>
+              <w:pStyle w:val="Compact"/>
+              <w:jc w:val="left"/>
+            </w:pPr>
+            <w:r>
+              <w:t xml:space="preserve">0.001</w:t>
+            </w:r>
+          </w:p>
+        </w:tc>
+        <w:tc>
+          <w:tcPr/>
+          <w:p>
+            <w:pPr>
+              <w:pStyle w:val="Compact"/>
+              <w:jc w:val="left"/>
+            </w:pPr>
+            <w:r>
+              <w:t xml:space="preserve">96</w:t>
+            </w:r>
+          </w:p>
+        </w:tc>
+        <w:tc>
+          <w:tcPr/>
+          <w:p>
+            <w:pPr>
+              <w:pStyle w:val="Compact"/>
+              <w:jc w:val="left"/>
+            </w:pPr>
+            <w:r>
+              <w:t xml:space="preserve">7,425</w:t>
+            </w:r>
+          </w:p>
+        </w:tc>
+        <w:tc>
+          <w:tcPr/>
+          <w:p>
+            <w:pPr>
+              <w:pStyle w:val="Compact"/>
+              <w:jc w:val="left"/>
+            </w:pPr>
+            <w:r>
+              <w:t xml:space="preserve">0.00019</w:t>
+            </w:r>
+          </w:p>
+        </w:tc>
+        <w:tc>
+          <w:tcPr/>
+          <w:p>
+            <w:pPr>
+              <w:pStyle w:val="Compact"/>
+              <w:jc w:val="left"/>
+            </w:pPr>
+            <w:r>
+              <w:t xml:space="preserve">0.52</w:t>
+            </w:r>
+          </w:p>
+        </w:tc>
+        <w:tc>
+          <w:tcPr/>
+          <w:p>
+            <w:pPr>
+              <w:pStyle w:val="Compact"/>
+              <w:jc w:val="left"/>
+            </w:pPr>
+            <w:r>
+              <w:t xml:space="preserve">44 / 3,421</w:t>
+            </w:r>
+          </w:p>
+        </w:tc>
+        <w:tc>
+          <w:tcPr/>
+          <w:p>
+            <w:pPr>
+              <w:pStyle w:val="Compact"/>
+              <w:jc w:val="left"/>
+            </w:pPr>
+            <w:r>
+              <w:t xml:space="preserve">119858 / 9,229,099</w:t>
+            </w:r>
+          </w:p>
+        </w:tc>
+        <w:tc>
+          <w:tcPr/>
+          <w:p>
+            <w:pPr>
+              <w:pStyle w:val="Compact"/>
+              <w:jc w:val="left"/>
+            </w:pPr>
+            <w:r>
+              <w:t xml:space="preserve">1243×</w:t>
             </w:r>
           </w:p>
         </w:tc>
@@ -11896,7 +12262,7 @@
               <w:jc w:val="left"/>
             </w:pPr>
             <w:r>
-              <w:t xml:space="preserve">–</w:t>
+              <w:t xml:space="preserve">3,051</w:t>
             </w:r>
           </w:p>
         </w:tc>
@@ -11920,7 +12286,7 @@
               <w:jc w:val="left"/>
             </w:pPr>
             <w:r>
-              <w:t xml:space="preserve">–</w:t>
+              <w:t xml:space="preserve">5.9×</w:t>
             </w:r>
           </w:p>
         </w:tc>
@@ -11994,7 +12360,7 @@
               <w:jc w:val="left"/>
             </w:pPr>
             <w:r>
-              <w:t xml:space="preserve">–</w:t>
+              <w:t xml:space="preserve">1,573</w:t>
             </w:r>
           </w:p>
         </w:tc>
@@ -12018,7 +12384,7 @@
               <w:jc w:val="left"/>
             </w:pPr>
             <w:r>
-              <w:t xml:space="preserve">–</w:t>
+              <w:t xml:space="preserve">9.0×</w:t>
             </w:r>
           </w:p>
         </w:tc>
@@ -12092,7 +12458,7 @@
               <w:jc w:val="left"/>
             </w:pPr>
             <w:r>
-              <w:t xml:space="preserve">–</w:t>
+              <w:t xml:space="preserve">2,497</w:t>
             </w:r>
           </w:p>
         </w:tc>
@@ -12116,7 +12482,7 @@
               <w:jc w:val="left"/>
             </w:pPr>
             <w:r>
-              <w:t xml:space="preserve">–</w:t>
+              <w:t xml:space="preserve">14×</w:t>
             </w:r>
           </w:p>
         </w:tc>
@@ -12190,6 +12556,18 @@
               <w:jc w:val="left"/>
             </w:pPr>
             <w:r>
+              <w:t xml:space="preserve">7,425</w:t>
+            </w:r>
+          </w:p>
+        </w:tc>
+        <w:tc>
+          <w:tcPr/>
+          <w:p>
+            <w:pPr>
+              <w:pStyle w:val="Compact"/>
+              <w:jc w:val="left"/>
+            </w:pPr>
+            <w:r>
               <w:t xml:space="preserve">–</w:t>
             </w:r>
           </w:p>
@@ -12202,19 +12580,7 @@
               <w:jc w:val="left"/>
             </w:pPr>
             <w:r>
-              <w:t xml:space="preserve">–</w:t>
-            </w:r>
-          </w:p>
-        </w:tc>
-        <w:tc>
-          <w:tcPr/>
-          <w:p>
-            <w:pPr>
-              <w:pStyle w:val="Compact"/>
-              <w:jc w:val="left"/>
-            </w:pPr>
-            <w:r>
-              <w:t xml:space="preserve">–</w:t>
+              <w:t xml:space="preserve">10×</w:t>
             </w:r>
           </w:p>
         </w:tc>
@@ -14343,7 +14709,7 @@
         <w:t xml:space="preserve"> </w:t>
       </w:r>
       <w:r>
-        <w:t xml:space="preserve">— definition, validation, 30–600× fewer CX than certified.</w:t>
+        <w:t xml:space="preserve">— definition, validation, 30–1300× fewer CX than certified.</w:t>
       </w:r>
     </w:p>
     <w:p>

</xml_diff>